<commit_message>
test: the spacing-split fixture reads the same out of DOCX and ODT
- its headings no longer set single spacing explicitly, which the two
  importers read differently
- the page-top notes move into the extensions CLAUDE.md, within the
  architecture docs' line budget
</commit_message>
<xml_diff>
--- a/tests/corpus/21-spacing-split.docx
+++ b/tests/corpus/21-spacing-split.docx
@@ -5,7 +5,7 @@
     <w:p>
       <w:pPr>
         <w:keepNext/>
-        <w:spacing w:before="200" w:line="240"/>
+        <w:spacing w:before="200"/>
       </w:pPr>
       <w:r>
         <w:rPr>
@@ -26,7 +26,7 @@
     <w:p>
       <w:pPr>
         <w:keepNext/>
-        <w:spacing w:before="200" w:line="240"/>
+        <w:spacing w:before="200"/>
       </w:pPr>
       <w:r>
         <w:rPr>
@@ -47,7 +47,7 @@
     <w:p>
       <w:pPr>
         <w:keepNext/>
-        <w:spacing w:before="200" w:line="240"/>
+        <w:spacing w:before="200"/>
       </w:pPr>
       <w:r>
         <w:rPr>
@@ -68,7 +68,7 @@
     <w:p>
       <w:pPr>
         <w:keepNext/>
-        <w:spacing w:before="200" w:line="240"/>
+        <w:spacing w:before="200"/>
       </w:pPr>
       <w:r>
         <w:rPr>
@@ -89,7 +89,7 @@
     <w:p>
       <w:pPr>
         <w:keepNext/>
-        <w:spacing w:before="200" w:line="240"/>
+        <w:spacing w:before="200"/>
       </w:pPr>
       <w:r>
         <w:rPr>
@@ -110,7 +110,7 @@
     <w:p>
       <w:pPr>
         <w:keepNext/>
-        <w:spacing w:before="200" w:line="240"/>
+        <w:spacing w:before="200"/>
       </w:pPr>
       <w:r>
         <w:rPr>
@@ -131,7 +131,7 @@
     <w:p>
       <w:pPr>
         <w:keepNext/>
-        <w:spacing w:before="200" w:line="240"/>
+        <w:spacing w:before="200"/>
       </w:pPr>
       <w:r>
         <w:rPr>
@@ -152,7 +152,7 @@
     <w:p>
       <w:pPr>
         <w:keepNext/>
-        <w:spacing w:before="200" w:line="240"/>
+        <w:spacing w:before="200"/>
       </w:pPr>
       <w:r>
         <w:rPr>
@@ -173,7 +173,7 @@
     <w:p>
       <w:pPr>
         <w:keepNext/>
-        <w:spacing w:before="200" w:line="240"/>
+        <w:spacing w:before="200"/>
       </w:pPr>
       <w:r>
         <w:rPr>
@@ -194,7 +194,7 @@
     <w:p>
       <w:pPr>
         <w:keepNext/>
-        <w:spacing w:before="200" w:line="240"/>
+        <w:spacing w:before="200"/>
       </w:pPr>
       <w:r>
         <w:rPr>
@@ -215,7 +215,7 @@
     <w:p>
       <w:pPr>
         <w:keepNext/>
-        <w:spacing w:before="200" w:line="240"/>
+        <w:spacing w:before="200"/>
       </w:pPr>
       <w:r>
         <w:rPr>
@@ -236,7 +236,7 @@
     <w:p>
       <w:pPr>
         <w:keepNext/>
-        <w:spacing w:before="200" w:line="240"/>
+        <w:spacing w:before="200"/>
       </w:pPr>
       <w:r>
         <w:rPr>
@@ -257,7 +257,7 @@
     <w:p>
       <w:pPr>
         <w:keepNext/>
-        <w:spacing w:before="200" w:line="240"/>
+        <w:spacing w:before="200"/>
       </w:pPr>
       <w:r>
         <w:rPr>
@@ -278,7 +278,7 @@
     <w:p>
       <w:pPr>
         <w:keepNext/>
-        <w:spacing w:before="200" w:line="240"/>
+        <w:spacing w:before="200"/>
       </w:pPr>
       <w:r>
         <w:rPr>
@@ -299,7 +299,7 @@
     <w:p>
       <w:pPr>
         <w:keepNext/>
-        <w:spacing w:before="200" w:line="240"/>
+        <w:spacing w:before="200"/>
       </w:pPr>
       <w:r>
         <w:rPr>
@@ -320,7 +320,7 @@
     <w:p>
       <w:pPr>
         <w:keepNext/>
-        <w:spacing w:before="200" w:line="240"/>
+        <w:spacing w:before="200"/>
       </w:pPr>
       <w:r>
         <w:rPr>
@@ -341,7 +341,7 @@
     <w:p>
       <w:pPr>
         <w:keepNext/>
-        <w:spacing w:before="200" w:line="240"/>
+        <w:spacing w:before="200"/>
       </w:pPr>
       <w:r>
         <w:rPr>
@@ -362,7 +362,7 @@
     <w:p>
       <w:pPr>
         <w:keepNext/>
-        <w:spacing w:before="200" w:line="240"/>
+        <w:spacing w:before="200"/>
       </w:pPr>
       <w:r>
         <w:rPr>
@@ -383,7 +383,7 @@
     <w:p>
       <w:pPr>
         <w:keepNext/>
-        <w:spacing w:before="200" w:line="240"/>
+        <w:spacing w:before="200"/>
       </w:pPr>
       <w:r>
         <w:rPr>
@@ -404,7 +404,7 @@
     <w:p>
       <w:pPr>
         <w:keepNext/>
-        <w:spacing w:before="200" w:line="240"/>
+        <w:spacing w:before="200"/>
       </w:pPr>
       <w:r>
         <w:rPr>
@@ -425,7 +425,7 @@
     <w:p>
       <w:pPr>
         <w:keepNext/>
-        <w:spacing w:before="200" w:line="240"/>
+        <w:spacing w:before="200"/>
       </w:pPr>
       <w:r>
         <w:rPr>
@@ -446,7 +446,7 @@
     <w:p>
       <w:pPr>
         <w:keepNext/>
-        <w:spacing w:before="200" w:line="240"/>
+        <w:spacing w:before="200"/>
       </w:pPr>
       <w:r>
         <w:rPr>
@@ -467,7 +467,7 @@
     <w:p>
       <w:pPr>
         <w:keepNext/>
-        <w:spacing w:before="200" w:line="240"/>
+        <w:spacing w:before="200"/>
       </w:pPr>
       <w:r>
         <w:rPr>
@@ -488,7 +488,7 @@
     <w:p>
       <w:pPr>
         <w:keepNext/>
-        <w:spacing w:before="200" w:line="240"/>
+        <w:spacing w:before="200"/>
       </w:pPr>
       <w:r>
         <w:rPr>
@@ -509,7 +509,7 @@
     <w:p>
       <w:pPr>
         <w:keepNext/>
-        <w:spacing w:before="200" w:line="240"/>
+        <w:spacing w:before="200"/>
       </w:pPr>
       <w:r>
         <w:rPr>
@@ -530,7 +530,7 @@
     <w:p>
       <w:pPr>
         <w:keepNext/>
-        <w:spacing w:before="200" w:line="240"/>
+        <w:spacing w:before="200"/>
       </w:pPr>
       <w:r>
         <w:rPr>
@@ -551,7 +551,7 @@
     <w:p>
       <w:pPr>
         <w:keepNext/>
-        <w:spacing w:before="200" w:line="240"/>
+        <w:spacing w:before="200"/>
       </w:pPr>
       <w:r>
         <w:rPr>
@@ -572,7 +572,7 @@
     <w:p>
       <w:pPr>
         <w:keepNext/>
-        <w:spacing w:before="200" w:line="240"/>
+        <w:spacing w:before="200"/>
       </w:pPr>
       <w:r>
         <w:rPr>
@@ -593,7 +593,7 @@
     <w:p>
       <w:pPr>
         <w:keepNext/>
-        <w:spacing w:before="200" w:line="240"/>
+        <w:spacing w:before="200"/>
       </w:pPr>
       <w:r>
         <w:rPr>
@@ -614,7 +614,7 @@
     <w:p>
       <w:pPr>
         <w:keepNext/>
-        <w:spacing w:before="200" w:line="240"/>
+        <w:spacing w:before="200"/>
       </w:pPr>
       <w:r>
         <w:rPr>

</xml_diff>